<commit_message>
docs(pitch): update Surat Penawaran Aplikasi ERP
</commit_message>
<xml_diff>
--- a/docs/pitch/Surat_Penawaran_Aplikasi_ERP.docx
+++ b/docs/pitch/Surat_Penawaran_Aplikasi_ERP.docx
@@ -260,7 +260,7 @@
           <w:b/>
           <w:bCs/>
         </w:rPr>
-        <w:t xml:space="preserve">[Nama Perusahaan Calon Pelanggan]</w:t>
+        <w:t xml:space="preserve">TMA</w:t>
       </w:r>
     </w:p>
     <w:p>
@@ -268,7 +268,7 @@
         <w:spacing w:after="200"/>
       </w:pPr>
       <w:r>
-        <w:t xml:space="preserve">[Alamat]</w:t>
+        <w:t xml:space="preserve"/>
       </w:r>
     </w:p>
     <w:p>
@@ -295,7 +295,7 @@
         <w:jc w:val="both"/>
       </w:pPr>
       <w:r>
-        <w:t xml:space="preserve">Yang membuat aplikasi ini berbeda: dia belum jadi produk kaku. Tampilan, form, menu, sampai laporannya masih bisa saya sesuaikan mengikuti cara kerja perusahaan Anda, bukan sebaliknya. Aplikasinya juga ringan, dwibahasa (Indonesia dan Inggris), dan tetap jalan penuh walau tanpa internet karena data tersimpan di perangkat Anda sendiri (local-first).</w:t>
+        <w:t xml:space="preserve">Yang membuat aplikasi ini berbeda: dia belum jadi produk kaku. Tampilan, form, menu, sampai laporannya masih bisa saya sesuaikan mengikuti cara kerja perusahaan Anda, bukan sebaliknya. Aplikasinya juga ringan, dwibahasa (Indonesia dan Inggris), dan data tersimpan aman di cloud sehingga tersinkron otomatis antar perangkat. Kalau internet sedang putus, aplikasi tetap bisa dipakai dengan data lokal di perangkat, lalu menyinkron ulang begitu online kembali.</w:t>
       </w:r>
     </w:p>
     <w:p>
@@ -928,7 +928,7 @@
                 <w:sz w:val="20"/>
                 <w:szCs w:val="20"/>
               </w:rPr>
-              <w:t xml:space="preserve">Export Excel, import data, backup ke file, opsi sinkron cloud</w:t>
+              <w:t xml:space="preserve">Export Excel, import data, backup ke file, sinkron cloud otomatis</w:t>
             </w:r>
           </w:p>
         </w:tc>
@@ -1335,10 +1335,10 @@
           <w:b/>
           <w:bCs/>
         </w:rPr>
-        <w:t xml:space="preserve">Tersimpan di perangkat Anda.</w:t>
-      </w:r>
-      <w:r>
-        <w:t xml:space="preserve"> Secara bawaan, data disimpan di perangkat Anda sendiri, bukan di server pihak lain. Data tidak dikirim ke mana pun tanpa persetujuan Anda.</w:t>
+        <w:t xml:space="preserve">Tersimpan aman di cloud.</w:t>
+      </w:r>
+      <w:r>
+        <w:t xml:space="preserve"> Data tersimpan di layanan cloud tepercaya (Google Firebase) dan tersinkron otomatis antar perangkat, sehingga tim Anda melihat data yang sama secara real time. Akses dikunci lewat login, dan data tidak dibagikan ke siapa pun tanpa persetujuan Anda.</w:t>
       </w:r>
     </w:p>
     <w:p>
@@ -1375,10 +1375,10 @@
           <w:b/>
           <w:bCs/>
         </w:rPr>
-        <w:t xml:space="preserve">Sinkron cloud opsional.</w:t>
-      </w:r>
-      <w:r>
-        <w:t xml:space="preserve"> Fitur sinkron ke cloud hanya aktif kalau Anda sendiri yang mengaktifkannya. Kalau aktif, data disimpan di akun cloud Anda sebagai salinan, dengan akses terbatas.</w:t>
+        <w:t xml:space="preserve">Tetap jalan saat offline.</w:t>
+      </w:r>
+      <w:r>
+        <w:t xml:space="preserve"> Bila internet putus, aplikasi tetap bisa dipakai dengan data yang tersimpan sementara di perangkat, lalu otomatis menyinkron ke cloud begitu online kembali. Jadi pekerjaan tidak berhenti.</w:t>
       </w:r>
     </w:p>
     <w:p>
@@ -1398,7 +1398,7 @@
         <w:t xml:space="preserve">Backup dan pemulihan.</w:t>
       </w:r>
       <w:r>
-        <w:t xml:space="preserve"> Saya bantu siapkan rutinitas backup berkala ke file supaya data aman dari kerusakan perangkat, dan bisa dipulihkan kapan saja.</w:t>
+        <w:t xml:space="preserve"> Data dicadangkan otomatis ke cloud setiap hari (beberapa versi terakhir disimpan), dan Anda juga bisa ekspor cadangan ke file kapan saja. Bila perangkat rusak atau hilang, data tetap aman dan bisa dipulihkan.</w:t>
       </w:r>
     </w:p>
     <w:p>
@@ -1480,7 +1480,7 @@
           <w:i/>
           <w:iCs/>
         </w:rPr>
-        <w:t>Keamanan data itu tanggung jawab bersama. Penyimpanan lokal, backup rutin, dan opsi sinkron cloud menekan risiko kehilangan data sekecil mungkin, tapi backup berkala tetap saya sarankan sebagai kebiasaan.</w:t>
+        <w:t>Keamanan data itu tanggung jawab bersama. Penyimpanan cloud, backup otomatis harian, dan salinan lokal di perangkat menekan risiko kehilangan data sekecil mungkin, tapi ekspor cadangan ke file secara berkala tetap saya sarankan sebagai kebiasaan.</w:t>
       </w:r>
     </w:p>
     <w:p>

</xml_diff>